<commit_message>
code used for paper runs final
</commit_message>
<xml_diff>
--- a/analyses/paper/submission_materials/Figures.docx
+++ b/analyses/paper/submission_materials/Figures.docx
@@ -42,14 +42,11 @@
         <w:jc w:val="center"/>
       </w:pPr>
       <w:r>
-        <w:rPr>
-          <w:noProof/>
-        </w:rPr>
         <w:drawing>
-          <wp:inline distT="0" distB="0" distL="0" distR="0" wp14:anchorId="20437C00" wp14:editId="57F8C46B">
-            <wp:extent cx="5793129" cy="2892975"/>
-            <wp:effectExtent l="0" t="0" r="0" b="3175"/>
-            <wp:docPr id="1787323025" name="Picture 1" descr="A group of graphs showing different types of data&#10;&#10;Description automatically generated"/>
+          <wp:inline distT="0" distB="0" distL="0" distR="0" wp14:anchorId="4BD99D84" wp14:editId="1348115C">
+            <wp:extent cx="5731510" cy="4348480"/>
+            <wp:effectExtent l="0" t="0" r="2540" b="0"/>
+            <wp:docPr id="1869526131" name="Picture 1" descr="A group of graphs showing different types of data&#10;&#10;AI-generated content may be incorrect."/>
             <wp:cNvGraphicFramePr>
               <a:graphicFrameLocks xmlns:a="http://schemas.openxmlformats.org/drawingml/2006/main" noChangeAspect="1"/>
             </wp:cNvGraphicFramePr>
@@ -57,30 +54,23 @@
               <a:graphicData uri="http://schemas.openxmlformats.org/drawingml/2006/picture">
                 <pic:pic xmlns:pic="http://schemas.openxmlformats.org/drawingml/2006/picture">
                   <pic:nvPicPr>
-                    <pic:cNvPr id="1787323025" name="Picture 1" descr="A group of graphs showing different types of data&#10;&#10;Description automatically generated"/>
+                    <pic:cNvPr id="1869526131" name="Picture 1" descr="A group of graphs showing different types of data&#10;&#10;AI-generated content may be incorrect."/>
                     <pic:cNvPicPr/>
                   </pic:nvPicPr>
-                  <pic:blipFill rotWithShape="1">
+                  <pic:blipFill>
                     <a:blip r:embed="rId4"/>
-                    <a:srcRect r="327"/>
-                    <a:stretch/>
+                    <a:stretch>
+                      <a:fillRect/>
+                    </a:stretch>
                   </pic:blipFill>
-                  <pic:spPr bwMode="auto">
+                  <pic:spPr>
                     <a:xfrm>
                       <a:off x="0" y="0"/>
-                      <a:ext cx="5796791" cy="2894804"/>
+                      <a:ext cx="5731510" cy="4348480"/>
                     </a:xfrm>
                     <a:prstGeom prst="rect">
                       <a:avLst/>
                     </a:prstGeom>
-                    <a:ln>
-                      <a:noFill/>
-                    </a:ln>
-                    <a:extLst>
-                      <a:ext uri="{53640926-AAD7-44D8-BBD7-CCE9431645EC}">
-                        <a14:shadowObscured xmlns:a14="http://schemas.microsoft.com/office/drawing/2010/main"/>
-                      </a:ext>
-                    </a:extLst>
                   </pic:spPr>
                 </pic:pic>
               </a:graphicData>
@@ -108,14 +98,12 @@
         <w:jc w:val="center"/>
       </w:pPr>
       <w:r>
-        <w:rPr>
-          <w:noProof/>
-        </w:rPr>
+        <w:lastRenderedPageBreak/>
         <w:drawing>
-          <wp:inline distT="0" distB="0" distL="0" distR="0" wp14:anchorId="2498F3E5" wp14:editId="1AD150EA">
-            <wp:extent cx="5731510" cy="4051935"/>
-            <wp:effectExtent l="0" t="0" r="2540" b="5715"/>
-            <wp:docPr id="527569356" name="Picture 1" descr="A screenshot of a map&#10;&#10;AI-generated content may be incorrect."/>
+          <wp:inline distT="0" distB="0" distL="0" distR="0" wp14:anchorId="1817AE8A" wp14:editId="0D99A10B">
+            <wp:extent cx="5731510" cy="6048375"/>
+            <wp:effectExtent l="0" t="0" r="2540" b="9525"/>
+            <wp:docPr id="1319180192" name="Picture 1"/>
             <wp:cNvGraphicFramePr>
               <a:graphicFrameLocks xmlns:a="http://schemas.openxmlformats.org/drawingml/2006/main" noChangeAspect="1"/>
             </wp:cNvGraphicFramePr>
@@ -123,7 +111,7 @@
               <a:graphicData uri="http://schemas.openxmlformats.org/drawingml/2006/picture">
                 <pic:pic xmlns:pic="http://schemas.openxmlformats.org/drawingml/2006/picture">
                   <pic:nvPicPr>
-                    <pic:cNvPr id="527569356" name="Picture 1" descr="A screenshot of a map&#10;&#10;AI-generated content may be incorrect."/>
+                    <pic:cNvPr id="1319180192" name=""/>
                     <pic:cNvPicPr/>
                   </pic:nvPicPr>
                   <pic:blipFill>
@@ -135,7 +123,7 @@
                   <pic:spPr>
                     <a:xfrm>
                       <a:off x="0" y="0"/>
-                      <a:ext cx="5731510" cy="4051935"/>
+                      <a:ext cx="5731510" cy="6048375"/>
                     </a:xfrm>
                     <a:prstGeom prst="rect">
                       <a:avLst/>
@@ -188,7 +176,6 @@
           <w:i/>
           <w:iCs/>
         </w:rPr>
-        <w:lastRenderedPageBreak/>
         <w:t>Figure 3</w:t>
       </w:r>
       <w:r>
@@ -199,52 +186,6 @@
       <w:pPr>
         <w:jc w:val="center"/>
       </w:pPr>
-      <w:r>
-        <w:rPr>
-          <w:noProof/>
-        </w:rPr>
-        <w:drawing>
-          <wp:inline distT="0" distB="0" distL="0" distR="0" wp14:anchorId="6D6D0624" wp14:editId="0A917C6E">
-            <wp:extent cx="5414839" cy="3258141"/>
-            <wp:effectExtent l="0" t="0" r="0" b="0"/>
-            <wp:docPr id="128830967" name="Picture 1" descr="A graph of different colored lines&#10;&#10;Description automatically generated"/>
-            <wp:cNvGraphicFramePr>
-              <a:graphicFrameLocks xmlns:a="http://schemas.openxmlformats.org/drawingml/2006/main" noChangeAspect="1"/>
-            </wp:cNvGraphicFramePr>
-            <a:graphic xmlns:a="http://schemas.openxmlformats.org/drawingml/2006/main">
-              <a:graphicData uri="http://schemas.openxmlformats.org/drawingml/2006/picture">
-                <pic:pic xmlns:pic="http://schemas.openxmlformats.org/drawingml/2006/picture">
-                  <pic:nvPicPr>
-                    <pic:cNvPr id="0" name="Picture 1"/>
-                    <pic:cNvPicPr/>
-                  </pic:nvPicPr>
-                  <pic:blipFill>
-                    <a:blip r:embed="rId6">
-                      <a:extLst>
-                        <a:ext uri="{28A0092B-C50C-407E-A947-70E740481C1C}">
-                          <a14:useLocalDpi xmlns:a14="http://schemas.microsoft.com/office/drawing/2010/main" val="0"/>
-                        </a:ext>
-                      </a:extLst>
-                    </a:blip>
-                    <a:stretch>
-                      <a:fillRect/>
-                    </a:stretch>
-                  </pic:blipFill>
-                  <pic:spPr>
-                    <a:xfrm>
-                      <a:off x="0" y="0"/>
-                      <a:ext cx="5414839" cy="3258141"/>
-                    </a:xfrm>
-                    <a:prstGeom prst="rect">
-                      <a:avLst/>
-                    </a:prstGeom>
-                  </pic:spPr>
-                </pic:pic>
-              </a:graphicData>
-            </a:graphic>
-          </wp:inline>
-        </w:drawing>
-      </w:r>
     </w:p>
     <w:p>
       <w:pPr>
@@ -253,93 +194,16 @@
           <w:rStyle w:val="IntenseEmphasis"/>
         </w:rPr>
       </w:pPr>
-    </w:p>
-    <w:p>
-      <w:pPr>
-        <w:rPr>
-          <w:rFonts w:eastAsia="Times New Roman" w:cs="Times New Roman"/>
-          <w:i/>
-          <w:iCs/>
-          <w:lang w:val="en-US"/>
-          <w14:ligatures w14:val="none"/>
-        </w:rPr>
-      </w:pPr>
       <w:r>
         <w:rPr>
-          <w:rFonts w:eastAsia="Times New Roman" w:cs="Times New Roman"/>
-          <w:b/>
-          <w:bCs/>
-          <w:i/>
-          <w:iCs/>
-          <w:lang w:val="en-US"/>
-          <w14:ligatures w14:val="none"/>
+          <w:rStyle w:val="IntenseEmphasis"/>
         </w:rPr>
-        <w:t>Figure 4,</w:t>
-      </w:r>
-      <w:r>
-        <w:rPr>
-          <w:rFonts w:eastAsia="Times New Roman" w:cs="Times New Roman"/>
-          <w:b/>
-          <w:bCs/>
-          <w:lang w:val="en-US"/>
-          <w14:ligatures w14:val="none"/>
-        </w:rPr>
-        <w:t xml:space="preserve"> </w:t>
-      </w:r>
-      <w:r>
-        <w:rPr>
-          <w:rFonts w:eastAsia="Times New Roman" w:cs="Times New Roman"/>
-          <w:lang w:val="en-US"/>
-          <w14:ligatures w14:val="none"/>
-        </w:rPr>
-        <w:t>Incidence</w:t>
-      </w:r>
-      <w:r>
-        <w:rPr>
-          <w:rFonts w:eastAsia="Times New Roman" w:cs="Times New Roman"/>
-          <w:lang w:val="en-US"/>
-          <w14:ligatures w14:val="none"/>
-        </w:rPr>
-        <w:t xml:space="preserve"> of clinical malaria</w:t>
-      </w:r>
-      <w:r>
-        <w:rPr>
-          <w:rFonts w:eastAsia="Times New Roman" w:cs="Times New Roman"/>
-          <w:lang w:val="en-US"/>
-          <w14:ligatures w14:val="none"/>
-        </w:rPr>
-        <w:t xml:space="preserve"> pre- and post-vaccination by admin 1 unit</w:t>
-      </w:r>
-      <w:r>
-        <w:rPr>
-          <w:rFonts w:eastAsia="Times New Roman" w:cs="Times New Roman"/>
-          <w:lang w:val="en-US"/>
-          <w14:ligatures w14:val="none"/>
-        </w:rPr>
-        <w:t>. Solid line refers to an equal incidence rate before and after vaccine introduction.</w:t>
-      </w:r>
-    </w:p>
-    <w:p>
-      <w:pPr>
-        <w:jc w:val="center"/>
-        <w:rPr>
-          <w:rFonts w:eastAsia="Times New Roman" w:cs="Times New Roman"/>
-          <w:lang w:val="en-US"/>
-          <w14:ligatures w14:val="none"/>
-        </w:rPr>
-      </w:pPr>
-      <w:r>
-        <w:rPr>
-          <w:rFonts w:eastAsia="Times New Roman" w:cs="Times New Roman"/>
-          <w:noProof/>
-          <w:lang w:val="en-US"/>
-          <w14:ligatures w14:val="none"/>
-        </w:rPr>
+        <w:lastRenderedPageBreak/>
         <w:drawing>
-          <wp:inline distT="0" distB="0" distL="0" distR="0" wp14:anchorId="73E01C0F" wp14:editId="5E49AE89">
-            <wp:extent cx="5018567" cy="3834817"/>
-            <wp:effectExtent l="0" t="0" r="0" b="0"/>
-            <wp:docPr id="160786867" name="Picture 1" descr="A graph of a line with red and blue dots&#10;&#10;Description automatically generated"/>
+          <wp:inline distT="0" distB="0" distL="0" distR="0" wp14:anchorId="56949A61" wp14:editId="547442AE">
+            <wp:extent cx="5731510" cy="6048375"/>
+            <wp:effectExtent l="0" t="0" r="2540" b="9525"/>
+            <wp:docPr id="888596058" name="Picture 1"/>
             <wp:cNvGraphicFramePr>
               <a:graphicFrameLocks xmlns:a="http://schemas.openxmlformats.org/drawingml/2006/main" noChangeAspect="1"/>
             </wp:cNvGraphicFramePr>
@@ -347,11 +211,11 @@
               <a:graphicData uri="http://schemas.openxmlformats.org/drawingml/2006/picture">
                 <pic:pic xmlns:pic="http://schemas.openxmlformats.org/drawingml/2006/picture">
                   <pic:nvPicPr>
-                    <pic:cNvPr id="160786867" name="Picture 1" descr="A graph of a line with red and blue dots&#10;&#10;Description automatically generated"/>
+                    <pic:cNvPr id="888596058" name=""/>
                     <pic:cNvPicPr/>
                   </pic:nvPicPr>
                   <pic:blipFill>
-                    <a:blip r:embed="rId7"/>
+                    <a:blip r:embed="rId6"/>
                     <a:stretch>
                       <a:fillRect/>
                     </a:stretch>
@@ -359,7 +223,7 @@
                   <pic:spPr>
                     <a:xfrm>
                       <a:off x="0" y="0"/>
-                      <a:ext cx="5025133" cy="3839834"/>
+                      <a:ext cx="5731510" cy="6048375"/>
                     </a:xfrm>
                     <a:prstGeom prst="rect">
                       <a:avLst/>

</xml_diff>